<commit_message>
Derecho de petición al FNE: redacción neutral, sin datos personales
Co-Authored-By: Claude Opus 5.5 <noreply@anthropic.com>
Claude-Session: https://claude.ai/code/session_017xxjb3D5RmT4NBjn48W6Jx
</commit_message>
<xml_diff>
--- a/documentos/Derecho de petición FNE.docx
+++ b/documentos/Derecho de petición FNE.docx
@@ -67,26 +67,16 @@
         <w:t xml:space="preserve">Asunto:</w:t>
       </w:r>
       <w:r>
-        <w:t xml:space="preserve"> Derecho de petición de información y consulta sobre los requisitos para adquirir, importar, almacenar y usar psilocibina, psilocina y hongos que las contienen con fines de investigación científica.</w:t>
-      </w:r>
-    </w:p>
-    <w:p>
-      <w:pPr>
-        <w:spacing w:after="160"/>
-        <w:jc w:val="both"/>
-      </w:pPr>
-      <w:r>
-        <w:t xml:space="preserve">[Nombre completo], identificado(a) con cédula de ciudadanía n.º [número] de [ciudad], domiciliado(a) en [ciudad], actúa en nombre propio y como promotor(a) de la futura </w:t>
-      </w:r>
-      <w:r>
-        <w:rPr>
-          <w:b/>
-          <w:bCs/>
-        </w:rPr>
-        <w:t xml:space="preserve">Asociación Colombiana de Psilocibina</w:t>
-      </w:r>
-      <w:r>
-        <w:t xml:space="preserve">. La asociación está en etapa de constitución como entidad sin ánimo de lucro y aún no tiene NIT ni registro en la Cámara de Comercio.</w:t>
+        <w:t xml:space="preserve"> Derecho de petición de información y consulta sobre el estado actual y la situación jurídica de la psilocibina, la psilocina y los hongos que las contienen, y sobre los requisitos para su uso con fines de investigación científica.</w:t>
+      </w:r>
+    </w:p>
+    <w:p>
+      <w:pPr>
+        <w:spacing w:after="160"/>
+        <w:jc w:val="both"/>
+      </w:pPr>
+      <w:r>
+        <w:t xml:space="preserve">[Nombre completo], identificado con cédula de ciudadanía n.º [número], actuando en nombre propio, presento ante el Fondo Nacional de Estupefacientes el siguiente derecho de petición.</w:t>
       </w:r>
     </w:p>
     <w:p>
@@ -194,7 +184,7 @@
         <w:jc w:val="both"/>
       </w:pPr>
       <w:r>
-        <w:t xml:space="preserve">Promuevo la constitución de la Asociación Colombiana de Psilocibina como entidad sin ánimo de lucro. Su objeto será la investigación científica, la educación, la reducción de riesgos y daños y la participación en el debate público sobre la psilocibina. El objeto excluirá expresamente el cultivo, la producción, la distribución y la comercialización de sustancias fiscalizadas.</w:t>
+        <w:t xml:space="preserve">Tengo interés en conocer el estado actual y la situación jurídica de la psilocibina, la psilocina y los hongos que las contienen en Colombia, en especial las condiciones en que pueden usarse con fines de investigación científica.</w:t>
       </w:r>
     </w:p>
     <w:p>
@@ -208,7 +198,7 @@
         <w:jc w:val="both"/>
       </w:pPr>
       <w:r>
-        <w:t xml:space="preserve">Queremos que la asociación pueda tener psilocibina en un laboratorio, directamente o mediante aliados, para fines de investigación. Antes de constituirla y de adquirir cualquier sustancia, necesitamos conocer con certeza los requisitos y límites aplicables.</w:t>
+        <w:t xml:space="preserve">La psilocibina y la psilocina figuran en la Lista I del Convenio sobre Sustancias Sicotrópicas de 1971, aprobado por la Ley 43 de 1980. En el Anexo Técnico 1 vigente, reemplazado por la Resolución 116 de 2026, aparecen con los números 407 y 408 como "Lista Verde / Lista I".</w:t>
       </w:r>
     </w:p>
     <w:p>
@@ -222,7 +212,7 @@
         <w:jc w:val="both"/>
       </w:pPr>
       <w:r>
-        <w:t xml:space="preserve">La psilocibina y la psilocina figuran en la Lista I del Convenio sobre Sustancias Sicotrópicas de 1971, aprobado por la Ley 43 de 1980. En el Anexo Técnico 1 vigente, reemplazado por la Resolución 116 de 2026, aparecen con los números 407 y 408 como "Lista Verde / Lista I".</w:t>
+        <w:t xml:space="preserve">El artículo 3 de la Ley 30 de 1986 limita la producción, importación, distribución, uso y posesión de estupefacientes a "los fines médicos y científicos".</w:t>
       </w:r>
     </w:p>
     <w:p>
@@ -236,7 +226,7 @@
         <w:jc w:val="both"/>
       </w:pPr>
       <w:r>
-        <w:t xml:space="preserve">El artículo 3 de la Ley 30 de 1986 limita la producción, importación, distribución, uso y posesión de estupefacientes a "los fines médicos y científicos".</w:t>
+        <w:t xml:space="preserve">El artículo 3 de la Resolución 315 de 2020 extiende la fiscalización "a las mezclas y productos que las contengan". Ante duda razonable, permite pedir un concepto técnico al FNE.</w:t>
       </w:r>
     </w:p>
     <w:p>
@@ -250,7 +240,7 @@
         <w:jc w:val="both"/>
       </w:pPr>
       <w:r>
-        <w:t xml:space="preserve">El artículo 3 de la Resolución 315 de 2020 extiende la fiscalización "a las mezclas y productos que las contengan". Ante duda razonable, permite pedir un concepto técnico al FNE.</w:t>
+        <w:t xml:space="preserve">El artículo 11 de la misma resolución regula la inscripción para importar o comprar localmente sustancias fiscalizadas para investigación: materiales de referencia, reactivos o muestras.</w:t>
       </w:r>
     </w:p>
     <w:p>
@@ -264,7 +254,7 @@
         <w:jc w:val="both"/>
       </w:pPr>
       <w:r>
-        <w:t xml:space="preserve">El artículo 11 de la misma resolución regula la inscripción para importar o comprar localmente sustancias fiscalizadas para investigación: materiales de referencia, reactivos o muestras.</w:t>
+        <w:t xml:space="preserve">La Política Nacional de Drogas 2023-2033 dispone que "se promoverá la investigación científica sobre las propiedades, potencialidades y usos lícitos" de sustancias "tales como [...] la psilocibina proveniente de los hongos".</w:t>
       </w:r>
     </w:p>
     <w:p>
@@ -278,20 +268,6 @@
         <w:jc w:val="both"/>
       </w:pPr>
       <w:r>
-        <w:t xml:space="preserve">La Política Nacional de Drogas 2023-2033 dispone que "se promoverá la investigación científica sobre las propiedades, potencialidades y usos lícitos" de sustancias "tales como [...] la psilocibina proveniente de los hongos".</w:t>
-      </w:r>
-    </w:p>
-    <w:p>
-      <w:pPr>
-        <w:pStyle w:val="ListParagraph"/>
-        <w:numPr>
-          <w:ilvl w:val="0"/>
-          <w:numId w:val="3"/>
-        </w:numPr>
-        <w:spacing w:after="120"/>
-        <w:jc w:val="both"/>
-      </w:pPr>
-      <w:r>
         <w:t xml:space="preserve">No encontré información pública sobre inscripciones otorgadas por el FNE para investigar con psilocibina. Tampoco la encontré sobre el tratamiento regulatorio de los hongos que la contienen, sus esporas o su micelio.</w:t>
       </w:r>
     </w:p>
@@ -405,7 +381,7 @@
         <w:t xml:space="preserve">5. </w:t>
       </w:r>
       <w:r>
-        <w:t xml:space="preserve">¿Puede una entidad sin ánimo de lucro, como una asociación, inscribirse ante el FNE en la modalidad del artículo 11 de la Resolución 315 de 2020? ¿O debe ser una institución de educación superior, un centro de investigación reconocido por Minciencias, una IPS o un laboratorio con alguna habilitación especial?</w:t>
+        <w:t xml:space="preserve">¿Puede una entidad sin ánimo de lucro, como una asociación, corporación o fundación, inscribirse ante el FNE en la modalidad del artículo 11 de la Resolución 315 de 2020? ¿O debe ser una institución de educación superior, un centro de investigación reconocido por Minciencias, una IPS o un laboratorio con alguna habilitación especial?</w:t>
       </w:r>
     </w:p>
     <w:p>
@@ -453,7 +429,7 @@
         <w:t xml:space="preserve">8. </w:t>
       </w:r>
       <w:r>
-        <w:t xml:space="preserve">¿Puede la asociación, antes de obtener su NIT, pedir una evaluación previa u orientación sobre su proyecto de investigación?</w:t>
+        <w:t xml:space="preserve">¿Puede una persona natural, o una entidad que aún no tenga NIT, pedir orientación previa sobre un proyecto de investigación antes de iniciar el trámite de inscripción?</w:t>
       </w:r>
     </w:p>
     <w:p>
@@ -669,7 +645,7 @@
         <w:t xml:space="preserve">20. </w:t>
       </w:r>
       <w:r>
-        <w:t xml:space="preserve">¿Puede la asociación, sin estar inscrita, financiar o contratar investigación con psilocibina a cargo de una universidad o un laboratorio inscrito, bajo la figura de tercerización del parágrafo 2 del artículo 11? ¿Qué obligaciones y responsabilidades tendría la asociación en ese caso?</w:t>
+        <w:t xml:space="preserve">¿Puede una persona natural o una entidad sin ánimo de lucro, sin estar inscrita, financiar o contratar investigación con psilocibina a cargo de una universidad o un laboratorio inscrito, bajo la figura de tercerización del parágrafo 2 del artículo 11? ¿Qué obligaciones y responsabilidades tendría quien financia o contrata en ese caso?</w:t>
       </w:r>
     </w:p>
     <w:p>
@@ -886,7 +862,7 @@
         <w:t xml:space="preserve">31. </w:t>
       </w:r>
       <w:r>
-        <w:t xml:space="preserve">¿Requieren alguna autorización o reporte ante el FNE las actividades de la asociación que no implican tener ni manipular la sustancia, como educación, revisión de literatura, encuestas, eventos académicos o participación en el debate público?</w:t>
+        <w:t xml:space="preserve">¿Requieren alguna autorización o reporte ante el FNE las actividades de personas naturales o entidades sin ánimo de lucro que no implican tener ni manipular la sustancia, como educación, revisión de literatura, encuestas, eventos académicos o participación en el debate público?</w:t>
       </w:r>
     </w:p>
     <w:p>
@@ -902,7 +878,7 @@
         <w:t xml:space="preserve">32. </w:t>
       </w:r>
       <w:r>
-        <w:t xml:space="preserve">El artículo 9 de la Ley 30 de 1986 dispone que toda campaña "tendiente a evitar los cultivos y la producción, tráfico y consumo de sustancias estupefacientes" debe ser "dirigida y supervisada por el Consejo Nacional de Estupefacientes". El literal d) del artículo 91 le asigna a ese Consejo "supervisar la actividad de las entidades estatales y privadas que se ocupan de la prevención e investigación científica". ¿Debe la asociación registrarse, pedir autorización o reportar sus actividades educativas, de investigación o de reducción de riesgos ante ese Consejo? ¿Cómo se hace?</w:t>
+        <w:t xml:space="preserve">El artículo 9 de la Ley 30 de 1986 dispone que toda campaña "tendiente a evitar los cultivos y la producción, tráfico y consumo de sustancias estupefacientes" debe ser "dirigida y supervisada por el Consejo Nacional de Estupefacientes". El literal d) del artículo 91 le asigna a ese Consejo "supervisar la actividad de las entidades estatales y privadas que se ocupan de la prevención e investigación científica". ¿Debe una entidad privada sin ánimo de lucro que realice actividades educativas, de investigación o de reducción de riesgos sobre estas sustancias registrarse, pedir autorización o reportar esas actividades ante ese Consejo? ¿Cómo se hace?</w:t>
       </w:r>
     </w:p>
     <w:p>
@@ -969,7 +945,7 @@
         <w:jc w:val="both"/>
       </w:pPr>
       <w:r>
-        <w:t xml:space="preserve">Recibiré la respuesta en el correo electrónico [correo], en la dirección [dirección física] y en el teléfono [número]. Autorizo que la respuesta se me notifique por correo electrónico.</w:t>
+        <w:t xml:space="preserve">Recibiré la respuesta únicamente en el correo electrónico [correo electrónico]. Autorizo que la respuesta se me notifique por ese medio.</w:t>
       </w:r>
     </w:p>
     <w:p>
@@ -1010,7 +986,7 @@
         <w:spacing w:after="0"/>
       </w:pPr>
       <w:r>
-        <w:t xml:space="preserve">Promotor(a) de la Asociación Colombiana de Psilocibina (en constitución)</w:t>
+        <w:t xml:space="preserve">[correo electrónico]</w:t>
       </w:r>
     </w:p>
     <w:p>
@@ -1035,7 +1011,7 @@
         </w:numPr>
         <w:spacing w:after="120"/>
       </w:pPr>
-      <w:hyperlink w:history="1" r:id="rIdsgk8auqt6wchkspali-hb">
+      <w:hyperlink w:history="1" r:id="rIdfeqeffi_mmsypkusgvbnh">
         <w:r>
           <w:rPr>
             <w:rStyle w:val="Hyperlink"/>
@@ -1056,7 +1032,7 @@
         </w:numPr>
         <w:spacing w:after="120"/>
       </w:pPr>
-      <w:hyperlink w:history="1" r:id="rIdlqi8owdzh13a5eo8ffazm">
+      <w:hyperlink w:history="1" r:id="rIdex614p7j8ptib06joypkh">
         <w:r>
           <w:rPr>
             <w:rStyle w:val="Hyperlink"/>
@@ -1077,7 +1053,7 @@
         </w:numPr>
         <w:spacing w:after="120"/>
       </w:pPr>
-      <w:hyperlink w:history="1" r:id="rId4i6mux_vp1_q0qgp3_bgg">
+      <w:hyperlink w:history="1" r:id="rId_v7egkrvhtkwgtv3pfiws">
         <w:r>
           <w:rPr>
             <w:rStyle w:val="Hyperlink"/>
@@ -1098,7 +1074,7 @@
         </w:numPr>
         <w:spacing w:after="120"/>
       </w:pPr>
-      <w:hyperlink w:history="1" r:id="rIdufh1jjmhlgaraqrg8vfaw">
+      <w:hyperlink w:history="1" r:id="rIduzxcj67emzvavqf82rice">
         <w:r>
           <w:rPr>
             <w:rStyle w:val="Hyperlink"/>
@@ -1119,7 +1095,7 @@
         </w:numPr>
         <w:spacing w:after="120"/>
       </w:pPr>
-      <w:hyperlink w:history="1" r:id="rIdmwdsyoic65t5h0ysnpwlw">
+      <w:hyperlink w:history="1" r:id="rIdxoo3c-fwejfw64myep70g">
         <w:r>
           <w:rPr>
             <w:rStyle w:val="Hyperlink"/>
@@ -1140,7 +1116,7 @@
         </w:numPr>
         <w:spacing w:after="120"/>
       </w:pPr>
-      <w:hyperlink w:history="1" r:id="rIdmoqxxlgxerojs8ss16mmi">
+      <w:hyperlink w:history="1" r:id="rIdb4jad3f_muayrmvvaym1j">
         <w:r>
           <w:rPr>
             <w:rStyle w:val="Hyperlink"/>
@@ -1161,7 +1137,7 @@
         </w:numPr>
         <w:spacing w:after="120"/>
       </w:pPr>
-      <w:hyperlink w:history="1" r:id="rIdfzbrtesnzt649u55-y3yr">
+      <w:hyperlink w:history="1" r:id="rIddtl9kbonr2kbgud2ozuse">
         <w:r>
           <w:rPr>
             <w:rStyle w:val="Hyperlink"/>
@@ -1182,7 +1158,7 @@
         </w:numPr>
         <w:spacing w:after="120"/>
       </w:pPr>
-      <w:hyperlink w:history="1" r:id="rId0nrwbejihwykzevgxappk">
+      <w:hyperlink w:history="1" r:id="rIdwr5ryzhnse3o-auq8aqkp">
         <w:r>
           <w:rPr>
             <w:rStyle w:val="Hyperlink"/>
@@ -1203,7 +1179,7 @@
         </w:numPr>
         <w:spacing w:after="120"/>
       </w:pPr>
-      <w:hyperlink w:history="1" r:id="rIdsvm6n430cqkohlxweshxb">
+      <w:hyperlink w:history="1" r:id="rIdanomm6ej29azemsjllnd0">
         <w:r>
           <w:rPr>
             <w:rStyle w:val="Hyperlink"/>

</xml_diff>